<commit_message>
Second version of report 1
Second version of report 1
</commit_message>
<xml_diff>
--- a/SENG696 - Isaac Ng Report 1.docx
+++ b/SENG696 - Isaac Ng Report 1.docx
@@ -3199,7 +3199,37 @@
         <w:rPr>
           <w:lang w:val="en-GB"/>
         </w:rPr>
-        <w:t xml:space="preserve">conversation, NPC status, </w:t>
+        <w:t>conversation,</w:t>
+      </w:r>
+      <w:r>
+        <w:rPr>
+          <w:lang w:val="en-GB"/>
+        </w:rPr>
+        <w:t xml:space="preserve"> </w:t>
+      </w:r>
+      <w:r>
+        <w:rPr>
+          <w:lang w:val="en-GB"/>
+        </w:rPr>
+        <w:t>s</w:t>
+      </w:r>
+      <w:r>
+        <w:rPr>
+          <w:lang w:val="en-GB"/>
+        </w:rPr>
+        <w:t>tatus of NPC</w:t>
+      </w:r>
+      <w:r>
+        <w:rPr>
+          <w:lang w:val="en-GB"/>
+        </w:rPr>
+        <w:t>,</w:t>
+      </w:r>
+      <w:r>
+        <w:rPr>
+          <w:lang w:val="en-GB"/>
+        </w:rPr>
+        <w:t xml:space="preserve"> </w:t>
       </w:r>
       <w:r>
         <w:rPr>
@@ -3224,6 +3254,18 @@
           <w:lang w:val="en-GB"/>
         </w:rPr>
         <w:t>map</w:t>
+      </w:r>
+      <w:r>
+        <w:rPr>
+          <w:lang w:val="en-GB"/>
+        </w:rPr>
+        <w:t xml:space="preserve">, </w:t>
+      </w:r>
+      <w:r>
+        <w:rPr>
+          <w:lang w:val="en-GB"/>
+        </w:rPr>
+        <w:t>new-defined story</w:t>
       </w:r>
       <w:r>
         <w:rPr>
@@ -4778,6 +4820,601 @@
       </w:pPr>
       <w:r>
         <w:lastRenderedPageBreak/>
+        <w:t>Agent Architecture</w:t>
+      </w:r>
+    </w:p>
+    <w:p>
+      <w:pPr>
+        <w:rPr>
+          <w:b/>
+          <w:bCs/>
+          <w:u w:val="single"/>
+          <w:lang w:val="en-GB"/>
+        </w:rPr>
+      </w:pPr>
+      <w:r>
+        <w:rPr>
+          <w:b/>
+          <w:bCs/>
+          <w:u w:val="single"/>
+          <w:lang w:val="en-GB"/>
+        </w:rPr>
+        <w:t>Judge</w:t>
+      </w:r>
+      <w:r>
+        <w:rPr>
+          <w:b/>
+          <w:bCs/>
+          <w:u w:val="single"/>
+          <w:lang w:val="en-GB"/>
+        </w:rPr>
+        <w:t>, NPC</w:t>
+      </w:r>
+      <w:r>
+        <w:rPr>
+          <w:b/>
+          <w:bCs/>
+          <w:u w:val="single"/>
+          <w:lang w:val="en-GB"/>
+        </w:rPr>
+        <w:t>, Narrator</w:t>
+      </w:r>
+      <w:r>
+        <w:rPr>
+          <w:b/>
+          <w:bCs/>
+          <w:u w:val="single"/>
+          <w:lang w:val="en-GB"/>
+        </w:rPr>
+        <w:t>:</w:t>
+      </w:r>
+    </w:p>
+    <w:p>
+      <w:pPr>
+        <w:rPr>
+          <w:lang w:val="en-GB"/>
+        </w:rPr>
+      </w:pPr>
+      <w:r>
+        <w:rPr>
+          <w:noProof/>
+          <w:lang w:val="en-GB"/>
+        </w:rPr>
+        <w:drawing>
+          <wp:inline distT="0" distB="0" distL="0" distR="0" wp14:anchorId="3A1C95F3" wp14:editId="7DA5C7FA">
+            <wp:extent cx="5193102" cy="2018221"/>
+            <wp:effectExtent l="0" t="0" r="7620" b="1270"/>
+            <wp:docPr id="1388525442" name="圖片 44"/>
+            <wp:cNvGraphicFramePr>
+              <a:graphicFrameLocks xmlns:a="http://schemas.openxmlformats.org/drawingml/2006/main" noChangeAspect="1"/>
+            </wp:cNvGraphicFramePr>
+            <a:graphic xmlns:a="http://schemas.openxmlformats.org/drawingml/2006/main">
+              <a:graphicData uri="http://schemas.openxmlformats.org/drawingml/2006/picture">
+                <pic:pic xmlns:pic="http://schemas.openxmlformats.org/drawingml/2006/picture">
+                  <pic:nvPicPr>
+                    <pic:cNvPr id="0" name="Picture 44"/>
+                    <pic:cNvPicPr>
+                      <a:picLocks noChangeAspect="1" noChangeArrowheads="1"/>
+                    </pic:cNvPicPr>
+                  </pic:nvPicPr>
+                  <pic:blipFill>
+                    <a:blip r:embed="rId21">
+                      <a:extLst>
+                        <a:ext uri="{28A0092B-C50C-407E-A947-70E740481C1C}">
+                          <a14:useLocalDpi xmlns:a14="http://schemas.microsoft.com/office/drawing/2010/main" val="0"/>
+                        </a:ext>
+                      </a:extLst>
+                    </a:blip>
+                    <a:srcRect/>
+                    <a:stretch>
+                      <a:fillRect/>
+                    </a:stretch>
+                  </pic:blipFill>
+                  <pic:spPr bwMode="auto">
+                    <a:xfrm>
+                      <a:off x="0" y="0"/>
+                      <a:ext cx="5201893" cy="2021637"/>
+                    </a:xfrm>
+                    <a:prstGeom prst="rect">
+                      <a:avLst/>
+                    </a:prstGeom>
+                    <a:noFill/>
+                    <a:ln>
+                      <a:noFill/>
+                    </a:ln>
+                  </pic:spPr>
+                </pic:pic>
+              </a:graphicData>
+            </a:graphic>
+          </wp:inline>
+        </w:drawing>
+      </w:r>
+    </w:p>
+    <w:p>
+      <w:pPr>
+        <w:rPr>
+          <w:lang w:val="en-GB"/>
+        </w:rPr>
+      </w:pPr>
+      <w:r>
+        <w:rPr>
+          <w:lang w:val="en-GB"/>
+        </w:rPr>
+        <w:t>Listener:</w:t>
+      </w:r>
+    </w:p>
+    <w:p>
+      <w:pPr>
+        <w:pStyle w:val="a9"/>
+        <w:numPr>
+          <w:ilvl w:val="0"/>
+          <w:numId w:val="16"/>
+        </w:numPr>
+        <w:rPr>
+          <w:lang w:val="en-GB"/>
+        </w:rPr>
+      </w:pPr>
+      <w:r>
+        <w:rPr>
+          <w:lang w:val="en-GB"/>
+        </w:rPr>
+        <w:t>Receive and sent all</w:t>
+      </w:r>
+      <w:r>
+        <w:rPr>
+          <w:lang w:val="en-GB"/>
+        </w:rPr>
+        <w:t xml:space="preserve"> communication with other agents.</w:t>
+      </w:r>
+    </w:p>
+    <w:p>
+      <w:pPr>
+        <w:rPr>
+          <w:lang w:val="en-GB"/>
+        </w:rPr>
+      </w:pPr>
+      <w:r>
+        <w:rPr>
+          <w:lang w:val="en-GB"/>
+        </w:rPr>
+        <w:t>Processor:</w:t>
+      </w:r>
+    </w:p>
+    <w:p>
+      <w:pPr>
+        <w:pStyle w:val="a9"/>
+        <w:numPr>
+          <w:ilvl w:val="0"/>
+          <w:numId w:val="16"/>
+        </w:numPr>
+        <w:rPr>
+          <w:lang w:val="en-GB"/>
+        </w:rPr>
+      </w:pPr>
+      <w:r>
+        <w:rPr>
+          <w:lang w:val="en-GB"/>
+        </w:rPr>
+        <w:t>Pre-process and p</w:t>
+      </w:r>
+      <w:r>
+        <w:rPr>
+          <w:lang w:val="en-GB"/>
+        </w:rPr>
+        <w:t>ost-process the parameter to LLM</w:t>
+      </w:r>
+    </w:p>
+    <w:p>
+      <w:pPr>
+        <w:pStyle w:val="a9"/>
+        <w:numPr>
+          <w:ilvl w:val="0"/>
+          <w:numId w:val="16"/>
+        </w:numPr>
+        <w:rPr>
+          <w:lang w:val="en-GB"/>
+        </w:rPr>
+      </w:pPr>
+      <w:r>
+        <w:rPr>
+          <w:lang w:val="en-GB"/>
+        </w:rPr>
+        <w:t>Record and manage past record</w:t>
+      </w:r>
+      <w:r>
+        <w:rPr>
+          <w:lang w:val="en-GB"/>
+        </w:rPr>
+        <w:t xml:space="preserve"> and </w:t>
+      </w:r>
+      <w:r>
+        <w:rPr>
+          <w:lang w:val="en-GB"/>
+        </w:rPr>
+        <w:t>the specific data</w:t>
+      </w:r>
+      <w:r>
+        <w:rPr>
+          <w:lang w:val="en-GB"/>
+        </w:rPr>
+        <w:t>. I</w:t>
+      </w:r>
+      <w:r>
+        <w:rPr>
+          <w:lang w:val="en-GB"/>
+        </w:rPr>
+        <w:t>nput to LLM if necessary</w:t>
+      </w:r>
+    </w:p>
+    <w:p>
+      <w:pPr>
+        <w:pStyle w:val="a9"/>
+        <w:numPr>
+          <w:ilvl w:val="1"/>
+          <w:numId w:val="16"/>
+        </w:numPr>
+        <w:rPr>
+          <w:lang w:val="en-GB"/>
+        </w:rPr>
+      </w:pPr>
+      <w:r>
+        <w:rPr>
+          <w:lang w:val="en-GB"/>
+        </w:rPr>
+        <w:t>NPC</w:t>
+      </w:r>
+      <w:r>
+        <w:rPr>
+          <w:lang w:val="en-GB"/>
+        </w:rPr>
+        <w:t xml:space="preserve">: </w:t>
+      </w:r>
+      <w:r>
+        <w:rPr>
+          <w:lang w:val="en-GB"/>
+        </w:rPr>
+        <w:t>Status of NPC</w:t>
+      </w:r>
+    </w:p>
+    <w:p>
+      <w:pPr>
+        <w:pStyle w:val="a9"/>
+        <w:numPr>
+          <w:ilvl w:val="1"/>
+          <w:numId w:val="16"/>
+        </w:numPr>
+        <w:rPr>
+          <w:lang w:val="en-GB"/>
+        </w:rPr>
+      </w:pPr>
+      <w:r>
+        <w:rPr>
+          <w:lang w:val="en-GB"/>
+        </w:rPr>
+        <w:t>Narrator: Game State</w:t>
+      </w:r>
+      <w:r>
+        <w:rPr>
+          <w:lang w:val="en-GB"/>
+        </w:rPr>
+        <w:t xml:space="preserve"> (</w:t>
+      </w:r>
+      <w:r>
+        <w:rPr>
+          <w:lang w:val="en-GB"/>
+        </w:rPr>
+        <w:t>previous prompt and conversation, main character status, map,</w:t>
+      </w:r>
+      <w:r>
+        <w:rPr>
+          <w:lang w:val="en-GB"/>
+        </w:rPr>
+        <w:t xml:space="preserve"> s</w:t>
+      </w:r>
+      <w:r>
+        <w:rPr>
+          <w:lang w:val="en-GB"/>
+        </w:rPr>
+        <w:t>tatus of NPC</w:t>
+      </w:r>
+      <w:r>
+        <w:rPr>
+          <w:lang w:val="en-GB"/>
+        </w:rPr>
+        <w:t>,</w:t>
+      </w:r>
+      <w:r>
+        <w:rPr>
+          <w:lang w:val="en-GB"/>
+        </w:rPr>
+        <w:t xml:space="preserve"> new-defined story).</w:t>
+      </w:r>
+    </w:p>
+    <w:p>
+      <w:pPr>
+        <w:rPr>
+          <w:lang w:val="en-GB"/>
+        </w:rPr>
+      </w:pPr>
+      <w:r>
+        <w:rPr>
+          <w:lang w:val="en-GB"/>
+        </w:rPr>
+        <w:t>Reasoning LLM:</w:t>
+      </w:r>
+    </w:p>
+    <w:p>
+      <w:pPr>
+        <w:pStyle w:val="a9"/>
+        <w:numPr>
+          <w:ilvl w:val="0"/>
+          <w:numId w:val="17"/>
+        </w:numPr>
+        <w:rPr>
+          <w:lang w:val="en-GB"/>
+        </w:rPr>
+      </w:pPr>
+      <w:r>
+        <w:rPr>
+          <w:lang w:val="en-GB"/>
+        </w:rPr>
+        <w:t>Retrieve information from database based on task</w:t>
+      </w:r>
+      <w:r>
+        <w:rPr>
+          <w:lang w:val="en-GB"/>
+        </w:rPr>
+        <w:t xml:space="preserve">, and reasoning on </w:t>
+      </w:r>
+      <w:r>
+        <w:rPr>
+          <w:lang w:val="en-GB"/>
+        </w:rPr>
+        <w:t>the corresponding</w:t>
+      </w:r>
+      <w:r>
+        <w:rPr>
+          <w:lang w:val="en-GB"/>
+        </w:rPr>
+        <w:t xml:space="preserve"> answer. </w:t>
+      </w:r>
+    </w:p>
+    <w:p>
+      <w:pPr>
+        <w:rPr>
+          <w:b/>
+          <w:bCs/>
+          <w:u w:val="single"/>
+          <w:lang w:val="en-GB"/>
+        </w:rPr>
+      </w:pPr>
+      <w:r>
+        <w:rPr>
+          <w:b/>
+          <w:bCs/>
+          <w:u w:val="single"/>
+          <w:lang w:val="en-GB"/>
+        </w:rPr>
+        <w:t>Interface:</w:t>
+      </w:r>
+    </w:p>
+    <w:p>
+      <w:pPr>
+        <w:rPr>
+          <w:b/>
+          <w:bCs/>
+          <w:u w:val="single"/>
+          <w:lang w:val="en-GB"/>
+        </w:rPr>
+      </w:pPr>
+      <w:r>
+        <w:rPr>
+          <w:b/>
+          <w:bCs/>
+          <w:noProof/>
+          <w:u w:val="single"/>
+          <w:lang w:val="en-GB"/>
+        </w:rPr>
+        <w:lastRenderedPageBreak/>
+        <w:drawing>
+          <wp:inline distT="0" distB="0" distL="0" distR="0" wp14:anchorId="532E645F" wp14:editId="695B376D">
+            <wp:extent cx="4130470" cy="2631056"/>
+            <wp:effectExtent l="0" t="0" r="3810" b="0"/>
+            <wp:docPr id="454602183" name="圖片 45"/>
+            <wp:cNvGraphicFramePr>
+              <a:graphicFrameLocks xmlns:a="http://schemas.openxmlformats.org/drawingml/2006/main" noChangeAspect="1"/>
+            </wp:cNvGraphicFramePr>
+            <a:graphic xmlns:a="http://schemas.openxmlformats.org/drawingml/2006/main">
+              <a:graphicData uri="http://schemas.openxmlformats.org/drawingml/2006/picture">
+                <pic:pic xmlns:pic="http://schemas.openxmlformats.org/drawingml/2006/picture">
+                  <pic:nvPicPr>
+                    <pic:cNvPr id="0" name="Picture 45"/>
+                    <pic:cNvPicPr>
+                      <a:picLocks noChangeAspect="1" noChangeArrowheads="1"/>
+                    </pic:cNvPicPr>
+                  </pic:nvPicPr>
+                  <pic:blipFill>
+                    <a:blip r:embed="rId22">
+                      <a:extLst>
+                        <a:ext uri="{28A0092B-C50C-407E-A947-70E740481C1C}">
+                          <a14:useLocalDpi xmlns:a14="http://schemas.microsoft.com/office/drawing/2010/main" val="0"/>
+                        </a:ext>
+                      </a:extLst>
+                    </a:blip>
+                    <a:srcRect/>
+                    <a:stretch>
+                      <a:fillRect/>
+                    </a:stretch>
+                  </pic:blipFill>
+                  <pic:spPr bwMode="auto">
+                    <a:xfrm>
+                      <a:off x="0" y="0"/>
+                      <a:ext cx="4151298" cy="2644323"/>
+                    </a:xfrm>
+                    <a:prstGeom prst="rect">
+                      <a:avLst/>
+                    </a:prstGeom>
+                    <a:noFill/>
+                    <a:ln>
+                      <a:noFill/>
+                    </a:ln>
+                  </pic:spPr>
+                </pic:pic>
+              </a:graphicData>
+            </a:graphic>
+          </wp:inline>
+        </w:drawing>
+      </w:r>
+    </w:p>
+    <w:p>
+      <w:pPr>
+        <w:rPr>
+          <w:lang w:val="en-GB"/>
+        </w:rPr>
+      </w:pPr>
+      <w:r>
+        <w:rPr>
+          <w:lang w:val="en-GB"/>
+        </w:rPr>
+        <w:t>Listener:</w:t>
+      </w:r>
+    </w:p>
+    <w:p>
+      <w:pPr>
+        <w:pStyle w:val="a9"/>
+        <w:numPr>
+          <w:ilvl w:val="0"/>
+          <w:numId w:val="16"/>
+        </w:numPr>
+        <w:rPr>
+          <w:lang w:val="en-GB"/>
+        </w:rPr>
+      </w:pPr>
+      <w:r>
+        <w:rPr>
+          <w:lang w:val="en-GB"/>
+        </w:rPr>
+        <w:t>Receive and sent all communication with other agents.</w:t>
+      </w:r>
+    </w:p>
+    <w:p>
+      <w:pPr>
+        <w:pStyle w:val="a9"/>
+        <w:numPr>
+          <w:ilvl w:val="0"/>
+          <w:numId w:val="16"/>
+        </w:numPr>
+        <w:rPr>
+          <w:lang w:val="en-GB"/>
+        </w:rPr>
+      </w:pPr>
+      <w:r>
+        <w:rPr>
+          <w:lang w:val="en-GB"/>
+        </w:rPr>
+        <w:t>Manage the GUI</w:t>
+      </w:r>
+      <w:r>
+        <w:rPr>
+          <w:lang w:val="en-GB"/>
+        </w:rPr>
+        <w:t xml:space="preserve"> and its communication</w:t>
+      </w:r>
+    </w:p>
+    <w:p>
+      <w:pPr>
+        <w:rPr>
+          <w:lang w:val="en-GB"/>
+        </w:rPr>
+      </w:pPr>
+      <w:r>
+        <w:rPr>
+          <w:lang w:val="en-GB"/>
+        </w:rPr>
+        <w:t>Processor:</w:t>
+      </w:r>
+    </w:p>
+    <w:p>
+      <w:pPr>
+        <w:pStyle w:val="a9"/>
+        <w:numPr>
+          <w:ilvl w:val="0"/>
+          <w:numId w:val="16"/>
+        </w:numPr>
+        <w:rPr>
+          <w:lang w:val="en-GB"/>
+        </w:rPr>
+      </w:pPr>
+      <w:r>
+        <w:rPr>
+          <w:lang w:val="en-GB"/>
+        </w:rPr>
+        <w:t>Record and manage past record.</w:t>
+      </w:r>
+    </w:p>
+    <w:p>
+      <w:pPr>
+        <w:pStyle w:val="a9"/>
+        <w:numPr>
+          <w:ilvl w:val="0"/>
+          <w:numId w:val="16"/>
+        </w:numPr>
+        <w:rPr>
+          <w:lang w:val="en-GB"/>
+        </w:rPr>
+      </w:pPr>
+      <w:r>
+        <w:rPr>
+          <w:lang w:val="en-GB"/>
+        </w:rPr>
+        <w:t>Process GUI logic if needed.</w:t>
+      </w:r>
+    </w:p>
+    <w:p>
+      <w:pPr>
+        <w:rPr>
+          <w:b/>
+          <w:bCs/>
+          <w:u w:val="single"/>
+          <w:lang w:val="en-GB"/>
+        </w:rPr>
+      </w:pPr>
+      <w:r>
+        <w:rPr>
+          <w:b/>
+          <w:bCs/>
+          <w:u w:val="single"/>
+          <w:lang w:val="en-GB"/>
+        </w:rPr>
+        <w:t>Narrator:</w:t>
+      </w:r>
+    </w:p>
+    <w:p>
+      <w:pPr>
+        <w:rPr>
+          <w:lang w:val="en-GB"/>
+        </w:rPr>
+      </w:pPr>
+    </w:p>
+    <w:p>
+      <w:pPr>
+        <w:rPr>
+          <w:lang w:val="en-GB"/>
+        </w:rPr>
+      </w:pPr>
+    </w:p>
+    <w:p>
+      <w:pPr>
+        <w:rPr>
+          <w:lang w:val="en-GB"/>
+        </w:rPr>
+      </w:pPr>
+    </w:p>
+    <w:p>
+      <w:pPr>
+        <w:pStyle w:val="3"/>
+      </w:pPr>
+      <w:r>
         <w:t>Deployment Diagrams</w:t>
       </w:r>
     </w:p>
@@ -4843,6 +5480,7 @@
           <w:noProof/>
           <w:lang w:val="en-GB"/>
         </w:rPr>
+        <w:lastRenderedPageBreak/>
         <w:drawing>
           <wp:inline distT="0" distB="0" distL="0" distR="0" wp14:anchorId="4963498F" wp14:editId="1660C34C">
             <wp:extent cx="6391910" cy="2924175"/>
@@ -4861,7 +5499,7 @@
                     </pic:cNvPicPr>
                   </pic:nvPicPr>
                   <pic:blipFill>
-                    <a:blip r:embed="rId21">
+                    <a:blip r:embed="rId23">
                       <a:extLst>
                         <a:ext uri="{28A0092B-C50C-407E-A947-70E740481C1C}">
                           <a14:useLocalDpi xmlns:a14="http://schemas.microsoft.com/office/drawing/2010/main" val="0"/>
@@ -5556,6 +6194,119 @@
     </w:lvl>
   </w:abstractNum>
   <w:abstractNum w:abstractNumId="6" w15:restartNumberingAfterBreak="0">
+    <w:nsid w:val="33003241"/>
+    <w:multiLevelType w:val="hybridMultilevel"/>
+    <w:tmpl w:val="6BCE1A9A"/>
+    <w:lvl w:ilvl="0" w:tplc="04090001">
+      <w:start w:val="1"/>
+      <w:numFmt w:val="bullet"/>
+      <w:lvlText w:val=""/>
+      <w:lvlJc w:val="left"/>
+      <w:pPr>
+        <w:ind w:left="720" w:hanging="360"/>
+      </w:pPr>
+      <w:rPr>
+        <w:rFonts w:ascii="Symbol" w:hAnsi="Symbol" w:hint="default"/>
+      </w:rPr>
+    </w:lvl>
+    <w:lvl w:ilvl="1" w:tplc="04090003" w:tentative="1">
+      <w:start w:val="1"/>
+      <w:numFmt w:val="bullet"/>
+      <w:lvlText w:val="o"/>
+      <w:lvlJc w:val="left"/>
+      <w:pPr>
+        <w:ind w:left="1440" w:hanging="360"/>
+      </w:pPr>
+      <w:rPr>
+        <w:rFonts w:ascii="Courier New" w:hAnsi="Courier New" w:cs="Courier New" w:hint="default"/>
+      </w:rPr>
+    </w:lvl>
+    <w:lvl w:ilvl="2" w:tplc="04090005" w:tentative="1">
+      <w:start w:val="1"/>
+      <w:numFmt w:val="bullet"/>
+      <w:lvlText w:val=""/>
+      <w:lvlJc w:val="left"/>
+      <w:pPr>
+        <w:ind w:left="2160" w:hanging="360"/>
+      </w:pPr>
+      <w:rPr>
+        <w:rFonts w:ascii="Wingdings" w:hAnsi="Wingdings" w:hint="default"/>
+      </w:rPr>
+    </w:lvl>
+    <w:lvl w:ilvl="3" w:tplc="04090001" w:tentative="1">
+      <w:start w:val="1"/>
+      <w:numFmt w:val="bullet"/>
+      <w:lvlText w:val=""/>
+      <w:lvlJc w:val="left"/>
+      <w:pPr>
+        <w:ind w:left="2880" w:hanging="360"/>
+      </w:pPr>
+      <w:rPr>
+        <w:rFonts w:ascii="Symbol" w:hAnsi="Symbol" w:hint="default"/>
+      </w:rPr>
+    </w:lvl>
+    <w:lvl w:ilvl="4" w:tplc="04090003" w:tentative="1">
+      <w:start w:val="1"/>
+      <w:numFmt w:val="bullet"/>
+      <w:lvlText w:val="o"/>
+      <w:lvlJc w:val="left"/>
+      <w:pPr>
+        <w:ind w:left="3600" w:hanging="360"/>
+      </w:pPr>
+      <w:rPr>
+        <w:rFonts w:ascii="Courier New" w:hAnsi="Courier New" w:cs="Courier New" w:hint="default"/>
+      </w:rPr>
+    </w:lvl>
+    <w:lvl w:ilvl="5" w:tplc="04090005" w:tentative="1">
+      <w:start w:val="1"/>
+      <w:numFmt w:val="bullet"/>
+      <w:lvlText w:val=""/>
+      <w:lvlJc w:val="left"/>
+      <w:pPr>
+        <w:ind w:left="4320" w:hanging="360"/>
+      </w:pPr>
+      <w:rPr>
+        <w:rFonts w:ascii="Wingdings" w:hAnsi="Wingdings" w:hint="default"/>
+      </w:rPr>
+    </w:lvl>
+    <w:lvl w:ilvl="6" w:tplc="04090001" w:tentative="1">
+      <w:start w:val="1"/>
+      <w:numFmt w:val="bullet"/>
+      <w:lvlText w:val=""/>
+      <w:lvlJc w:val="left"/>
+      <w:pPr>
+        <w:ind w:left="5040" w:hanging="360"/>
+      </w:pPr>
+      <w:rPr>
+        <w:rFonts w:ascii="Symbol" w:hAnsi="Symbol" w:hint="default"/>
+      </w:rPr>
+    </w:lvl>
+    <w:lvl w:ilvl="7" w:tplc="04090003" w:tentative="1">
+      <w:start w:val="1"/>
+      <w:numFmt w:val="bullet"/>
+      <w:lvlText w:val="o"/>
+      <w:lvlJc w:val="left"/>
+      <w:pPr>
+        <w:ind w:left="5760" w:hanging="360"/>
+      </w:pPr>
+      <w:rPr>
+        <w:rFonts w:ascii="Courier New" w:hAnsi="Courier New" w:cs="Courier New" w:hint="default"/>
+      </w:rPr>
+    </w:lvl>
+    <w:lvl w:ilvl="8" w:tplc="04090005" w:tentative="1">
+      <w:start w:val="1"/>
+      <w:numFmt w:val="bullet"/>
+      <w:lvlText w:val=""/>
+      <w:lvlJc w:val="left"/>
+      <w:pPr>
+        <w:ind w:left="6480" w:hanging="360"/>
+      </w:pPr>
+      <w:rPr>
+        <w:rFonts w:ascii="Wingdings" w:hAnsi="Wingdings" w:hint="default"/>
+      </w:rPr>
+    </w:lvl>
+  </w:abstractNum>
+  <w:abstractNum w:abstractNumId="7" w15:restartNumberingAfterBreak="0">
     <w:nsid w:val="4A834E96"/>
     <w:multiLevelType w:val="multilevel"/>
     <w:tmpl w:val="0409001F"/>
@@ -5641,7 +6392,7 @@
       </w:pPr>
     </w:lvl>
   </w:abstractNum>
-  <w:abstractNum w:abstractNumId="7" w15:restartNumberingAfterBreak="0">
+  <w:abstractNum w:abstractNumId="8" w15:restartNumberingAfterBreak="0">
     <w:nsid w:val="56F8427D"/>
     <w:multiLevelType w:val="multilevel"/>
     <w:tmpl w:val="0409001F"/>
@@ -5727,7 +6478,120 @@
       </w:pPr>
     </w:lvl>
   </w:abstractNum>
-  <w:abstractNum w:abstractNumId="8" w15:restartNumberingAfterBreak="0">
+  <w:abstractNum w:abstractNumId="9" w15:restartNumberingAfterBreak="0">
+    <w:nsid w:val="5C2D73A0"/>
+    <w:multiLevelType w:val="hybridMultilevel"/>
+    <w:tmpl w:val="8D2C35FE"/>
+    <w:lvl w:ilvl="0" w:tplc="04090001">
+      <w:start w:val="1"/>
+      <w:numFmt w:val="bullet"/>
+      <w:lvlText w:val=""/>
+      <w:lvlJc w:val="left"/>
+      <w:pPr>
+        <w:ind w:left="720" w:hanging="360"/>
+      </w:pPr>
+      <w:rPr>
+        <w:rFonts w:ascii="Symbol" w:hAnsi="Symbol" w:hint="default"/>
+      </w:rPr>
+    </w:lvl>
+    <w:lvl w:ilvl="1" w:tplc="04090003">
+      <w:start w:val="1"/>
+      <w:numFmt w:val="bullet"/>
+      <w:lvlText w:val="o"/>
+      <w:lvlJc w:val="left"/>
+      <w:pPr>
+        <w:ind w:left="1440" w:hanging="360"/>
+      </w:pPr>
+      <w:rPr>
+        <w:rFonts w:ascii="Courier New" w:hAnsi="Courier New" w:cs="Courier New" w:hint="default"/>
+      </w:rPr>
+    </w:lvl>
+    <w:lvl w:ilvl="2" w:tplc="04090005" w:tentative="1">
+      <w:start w:val="1"/>
+      <w:numFmt w:val="bullet"/>
+      <w:lvlText w:val=""/>
+      <w:lvlJc w:val="left"/>
+      <w:pPr>
+        <w:ind w:left="2160" w:hanging="360"/>
+      </w:pPr>
+      <w:rPr>
+        <w:rFonts w:ascii="Wingdings" w:hAnsi="Wingdings" w:hint="default"/>
+      </w:rPr>
+    </w:lvl>
+    <w:lvl w:ilvl="3" w:tplc="04090001" w:tentative="1">
+      <w:start w:val="1"/>
+      <w:numFmt w:val="bullet"/>
+      <w:lvlText w:val=""/>
+      <w:lvlJc w:val="left"/>
+      <w:pPr>
+        <w:ind w:left="2880" w:hanging="360"/>
+      </w:pPr>
+      <w:rPr>
+        <w:rFonts w:ascii="Symbol" w:hAnsi="Symbol" w:hint="default"/>
+      </w:rPr>
+    </w:lvl>
+    <w:lvl w:ilvl="4" w:tplc="04090003" w:tentative="1">
+      <w:start w:val="1"/>
+      <w:numFmt w:val="bullet"/>
+      <w:lvlText w:val="o"/>
+      <w:lvlJc w:val="left"/>
+      <w:pPr>
+        <w:ind w:left="3600" w:hanging="360"/>
+      </w:pPr>
+      <w:rPr>
+        <w:rFonts w:ascii="Courier New" w:hAnsi="Courier New" w:cs="Courier New" w:hint="default"/>
+      </w:rPr>
+    </w:lvl>
+    <w:lvl w:ilvl="5" w:tplc="04090005" w:tentative="1">
+      <w:start w:val="1"/>
+      <w:numFmt w:val="bullet"/>
+      <w:lvlText w:val=""/>
+      <w:lvlJc w:val="left"/>
+      <w:pPr>
+        <w:ind w:left="4320" w:hanging="360"/>
+      </w:pPr>
+      <w:rPr>
+        <w:rFonts w:ascii="Wingdings" w:hAnsi="Wingdings" w:hint="default"/>
+      </w:rPr>
+    </w:lvl>
+    <w:lvl w:ilvl="6" w:tplc="04090001" w:tentative="1">
+      <w:start w:val="1"/>
+      <w:numFmt w:val="bullet"/>
+      <w:lvlText w:val=""/>
+      <w:lvlJc w:val="left"/>
+      <w:pPr>
+        <w:ind w:left="5040" w:hanging="360"/>
+      </w:pPr>
+      <w:rPr>
+        <w:rFonts w:ascii="Symbol" w:hAnsi="Symbol" w:hint="default"/>
+      </w:rPr>
+    </w:lvl>
+    <w:lvl w:ilvl="7" w:tplc="04090003" w:tentative="1">
+      <w:start w:val="1"/>
+      <w:numFmt w:val="bullet"/>
+      <w:lvlText w:val="o"/>
+      <w:lvlJc w:val="left"/>
+      <w:pPr>
+        <w:ind w:left="5760" w:hanging="360"/>
+      </w:pPr>
+      <w:rPr>
+        <w:rFonts w:ascii="Courier New" w:hAnsi="Courier New" w:cs="Courier New" w:hint="default"/>
+      </w:rPr>
+    </w:lvl>
+    <w:lvl w:ilvl="8" w:tplc="04090005" w:tentative="1">
+      <w:start w:val="1"/>
+      <w:numFmt w:val="bullet"/>
+      <w:lvlText w:val=""/>
+      <w:lvlJc w:val="left"/>
+      <w:pPr>
+        <w:ind w:left="6480" w:hanging="360"/>
+      </w:pPr>
+      <w:rPr>
+        <w:rFonts w:ascii="Wingdings" w:hAnsi="Wingdings" w:hint="default"/>
+      </w:rPr>
+    </w:lvl>
+  </w:abstractNum>
+  <w:abstractNum w:abstractNumId="10" w15:restartNumberingAfterBreak="0">
     <w:nsid w:val="641D7380"/>
     <w:multiLevelType w:val="hybridMultilevel"/>
     <w:tmpl w:val="86640C28"/>
@@ -5840,7 +6704,7 @@
       </w:rPr>
     </w:lvl>
   </w:abstractNum>
-  <w:abstractNum w:abstractNumId="9" w15:restartNumberingAfterBreak="0">
+  <w:abstractNum w:abstractNumId="11" w15:restartNumberingAfterBreak="0">
     <w:nsid w:val="6F2B22B6"/>
     <w:multiLevelType w:val="hybridMultilevel"/>
     <w:tmpl w:val="DFE88770"/>
@@ -5953,7 +6817,7 @@
       </w:rPr>
     </w:lvl>
   </w:abstractNum>
-  <w:abstractNum w:abstractNumId="10" w15:restartNumberingAfterBreak="0">
+  <w:abstractNum w:abstractNumId="12" w15:restartNumberingAfterBreak="0">
     <w:nsid w:val="727A0401"/>
     <w:multiLevelType w:val="hybridMultilevel"/>
     <w:tmpl w:val="7528F7A0"/>
@@ -6066,7 +6930,7 @@
       </w:rPr>
     </w:lvl>
   </w:abstractNum>
-  <w:abstractNum w:abstractNumId="11" w15:restartNumberingAfterBreak="0">
+  <w:abstractNum w:abstractNumId="13" w15:restartNumberingAfterBreak="0">
     <w:nsid w:val="7DA44D5F"/>
     <w:multiLevelType w:val="hybridMultilevel"/>
     <w:tmpl w:val="0BC03760"/>
@@ -6192,7 +7056,7 @@
     <w:abstractNumId w:val="2"/>
   </w:num>
   <w:num w:numId="5" w16cid:durableId="1861777701">
-    <w:abstractNumId w:val="6"/>
+    <w:abstractNumId w:val="7"/>
   </w:num>
   <w:num w:numId="6" w16cid:durableId="1688603715">
     <w:abstractNumId w:val="2"/>
@@ -6225,7 +7089,7 @@
     </w:lvlOverride>
   </w:num>
   <w:num w:numId="7" w16cid:durableId="67390617">
-    <w:abstractNumId w:val="7"/>
+    <w:abstractNumId w:val="8"/>
   </w:num>
   <w:num w:numId="8" w16cid:durableId="224032286">
     <w:abstractNumId w:val="4"/>
@@ -6267,16 +7131,22 @@
     </w:lvlOverride>
   </w:num>
   <w:num w:numId="12" w16cid:durableId="1923100047">
+    <w:abstractNumId w:val="13"/>
+  </w:num>
+  <w:num w:numId="13" w16cid:durableId="358776803">
+    <w:abstractNumId w:val="12"/>
+  </w:num>
+  <w:num w:numId="14" w16cid:durableId="1065101356">
+    <w:abstractNumId w:val="10"/>
+  </w:num>
+  <w:num w:numId="15" w16cid:durableId="371882898">
     <w:abstractNumId w:val="11"/>
   </w:num>
-  <w:num w:numId="13" w16cid:durableId="358776803">
-    <w:abstractNumId w:val="10"/>
+  <w:num w:numId="16" w16cid:durableId="953095334">
+    <w:abstractNumId w:val="9"/>
   </w:num>
-  <w:num w:numId="14" w16cid:durableId="1065101356">
-    <w:abstractNumId w:val="8"/>
-  </w:num>
-  <w:num w:numId="15" w16cid:durableId="371882898">
-    <w:abstractNumId w:val="9"/>
+  <w:num w:numId="17" w16cid:durableId="2065250001">
+    <w:abstractNumId w:val="6"/>
   </w:num>
 </w:numbering>
 </file>

</xml_diff>